<commit_message>
hr and grqphl interview
</commit_message>
<xml_diff>
--- a/hr arround.docx
+++ b/hr arround.docx
@@ -69,201 +69,349 @@
         <w:pStyle w:val="ListParagraph"/>
         <w:rPr>
           <w:rFonts w:ascii="Times New Roman" w:hAnsi="Times New Roman" w:cs="Times New Roman"/>
+          <w:b/>
+          <w:sz w:val="30"/>
+          <w:szCs w:val="30"/>
+        </w:rPr>
+      </w:pPr>
+      <w:r>
+        <w:rPr>
+          <w:rFonts w:ascii="Times New Roman" w:hAnsi="Times New Roman" w:cs="Times New Roman"/>
+          <w:b/>
+          <w:sz w:val="30"/>
+          <w:szCs w:val="30"/>
+        </w:rPr>
+        <w:t>HR</w:t>
+      </w:r>
+    </w:p>
+    <w:p>
+      <w:pPr>
+        <w:pStyle w:val="ListParagraph"/>
+        <w:rPr>
+          <w:rFonts w:ascii="Times New Roman" w:eastAsia="Times New Roman" w:hAnsi="Times New Roman" w:cs="Times New Roman"/>
+          <w:sz w:val="24"/>
+          <w:szCs w:val="24"/>
+          <w:lang w:eastAsia="en-IN"/>
+        </w:rPr>
+      </w:pPr>
+      <w:r>
+        <w:rPr>
+          <w:rFonts w:ascii="Times New Roman" w:eastAsia="Times New Roman" w:hAnsi="Times New Roman" w:cs="Times New Roman"/>
+          <w:sz w:val="24"/>
+          <w:szCs w:val="24"/>
+          <w:lang w:eastAsia="en-IN"/>
+        </w:rPr>
+        <w:t>Hi, I'm Ankit Kumar. I have around 5 years and 3 months of experience as a Software Engineer.</w:t>
+      </w:r>
+    </w:p>
+    <w:p>
+      <w:pPr>
+        <w:pStyle w:val="ListParagraph"/>
+        <w:rPr>
+          <w:rFonts w:ascii="Times New Roman" w:eastAsia="Times New Roman" w:hAnsi="Times New Roman" w:cs="Times New Roman"/>
+          <w:sz w:val="24"/>
+          <w:szCs w:val="24"/>
+          <w:lang w:eastAsia="en-IN"/>
+        </w:rPr>
+      </w:pPr>
+      <w:r>
+        <w:rPr>
+          <w:rFonts w:ascii="Times New Roman" w:eastAsia="Times New Roman" w:hAnsi="Times New Roman" w:cs="Times New Roman"/>
+          <w:sz w:val="24"/>
+          <w:szCs w:val="24"/>
+          <w:lang w:eastAsia="en-IN"/>
+        </w:rPr>
+        <w:t>Currently, I am working on large-scale web applications where I contribute across both frontend and backend development. My primary skills are React.js, Next.js, Node.js, Nest.js, JavaScript, and TypeScript.</w:t>
+      </w:r>
+    </w:p>
+    <w:p>
+      <w:pPr>
+        <w:pStyle w:val="ListParagraph"/>
+        <w:rPr>
+          <w:rFonts w:ascii="Times New Roman" w:eastAsia="Times New Roman" w:hAnsi="Times New Roman" w:cs="Times New Roman"/>
+          <w:sz w:val="24"/>
+          <w:szCs w:val="24"/>
+          <w:lang w:eastAsia="en-IN"/>
+        </w:rPr>
+      </w:pPr>
+      <w:r>
+        <w:rPr>
+          <w:rFonts w:ascii="Times New Roman" w:eastAsia="Times New Roman" w:hAnsi="Times New Roman" w:cs="Times New Roman"/>
+          <w:sz w:val="24"/>
+          <w:szCs w:val="24"/>
+          <w:lang w:eastAsia="en-IN"/>
+        </w:rPr>
+        <w:t>Over the years, I have worked on multiple products involving job marketplaces, healthcare platforms, AI-powered matching systems, payment integrations, analytics dashboards, and cloud-based solutions on AWS.</w:t>
+      </w:r>
+    </w:p>
+    <w:p>
+      <w:pPr>
+        <w:pStyle w:val="ListParagraph"/>
+        <w:rPr>
+          <w:rFonts w:ascii="Times New Roman" w:eastAsia="Times New Roman" w:hAnsi="Times New Roman" w:cs="Times New Roman"/>
+          <w:sz w:val="24"/>
+          <w:szCs w:val="24"/>
+          <w:lang w:eastAsia="en-IN"/>
+        </w:rPr>
+      </w:pPr>
+      <w:r>
+        <w:rPr>
+          <w:rFonts w:ascii="Times New Roman" w:eastAsia="Times New Roman" w:hAnsi="Times New Roman" w:cs="Times New Roman"/>
+          <w:sz w:val="24"/>
+          <w:szCs w:val="24"/>
+          <w:lang w:eastAsia="en-IN"/>
+        </w:rPr>
+        <w:t>Apart from development, I enjoy solving business problems, collaborating with cross-functional teams, and continuously learning new technologies. I'm currently looking for opportunities where I can take ownership of complex systems and contribute to scalable product development.</w:t>
+      </w:r>
+    </w:p>
+    <w:p>
+      <w:pPr>
+        <w:pStyle w:val="ListParagraph"/>
+        <w:rPr>
+          <w:rFonts w:ascii="Times New Roman" w:eastAsia="Times New Roman" w:hAnsi="Times New Roman" w:cs="Times New Roman"/>
+          <w:sz w:val="24"/>
+          <w:szCs w:val="24"/>
+          <w:lang w:eastAsia="en-IN"/>
+        </w:rPr>
+      </w:pPr>
+    </w:p>
+    <w:p>
+      <w:pPr>
+        <w:pStyle w:val="ListParagraph"/>
+        <w:rPr>
+          <w:rFonts w:ascii="Times New Roman" w:eastAsia="Times New Roman" w:hAnsi="Times New Roman" w:cs="Times New Roman"/>
+          <w:b/>
+          <w:sz w:val="30"/>
+          <w:szCs w:val="30"/>
+          <w:lang w:eastAsia="en-IN"/>
+        </w:rPr>
+      </w:pPr>
+      <w:r>
+        <w:rPr>
+          <w:rFonts w:ascii="Times New Roman" w:eastAsia="Times New Roman" w:hAnsi="Times New Roman" w:cs="Times New Roman"/>
+          <w:b/>
+          <w:sz w:val="30"/>
+          <w:szCs w:val="30"/>
+          <w:lang w:eastAsia="en-IN"/>
+        </w:rPr>
+        <w:t>Technical</w:t>
+      </w:r>
+    </w:p>
+    <w:p>
+      <w:pPr>
+        <w:pStyle w:val="ListParagraph"/>
+        <w:rPr>
+          <w:rFonts w:ascii="Times New Roman" w:eastAsia="Times New Roman" w:hAnsi="Times New Roman" w:cs="Times New Roman"/>
+          <w:sz w:val="24"/>
+          <w:szCs w:val="24"/>
+          <w:lang w:eastAsia="en-IN"/>
+        </w:rPr>
+      </w:pPr>
+      <w:r>
+        <w:rPr>
+          <w:rFonts w:ascii="Times New Roman" w:eastAsia="Times New Roman" w:hAnsi="Times New Roman" w:cs="Times New Roman"/>
+          <w:sz w:val="24"/>
+          <w:szCs w:val="24"/>
+          <w:lang w:eastAsia="en-IN"/>
+        </w:rPr>
+        <w:t>Hi, I'm Ankit Kumar. I have 5 years and 3 months of experience as a Full Stack Software Engineer.</w:t>
+      </w:r>
+    </w:p>
+    <w:p>
+      <w:pPr>
+        <w:pStyle w:val="ListParagraph"/>
+        <w:rPr>
+          <w:rFonts w:ascii="Times New Roman" w:eastAsia="Times New Roman" w:hAnsi="Times New Roman" w:cs="Times New Roman"/>
+          <w:sz w:val="24"/>
+          <w:szCs w:val="24"/>
+          <w:lang w:eastAsia="en-IN"/>
+        </w:rPr>
+      </w:pPr>
+    </w:p>
+    <w:p>
+      <w:pPr>
+        <w:pStyle w:val="ListParagraph"/>
+        <w:rPr>
+          <w:rFonts w:ascii="Times New Roman" w:eastAsia="Times New Roman" w:hAnsi="Times New Roman" w:cs="Times New Roman"/>
+          <w:sz w:val="24"/>
+          <w:szCs w:val="24"/>
+          <w:lang w:eastAsia="en-IN"/>
+        </w:rPr>
+      </w:pPr>
+      <w:r>
+        <w:rPr>
+          <w:rFonts w:ascii="Times New Roman" w:eastAsia="Times New Roman" w:hAnsi="Times New Roman" w:cs="Times New Roman"/>
+          <w:sz w:val="24"/>
+          <w:szCs w:val="24"/>
+          <w:lang w:eastAsia="en-IN"/>
+        </w:rPr>
+        <w:t>My core expertise is in JavaScript, TypeScript, React.js, Next.js, Node.js, and Nest.js. In my current role, I work on both frontend and backend systems, with roughly 70% frontend and 30% backend responsibilities.</w:t>
+      </w:r>
+    </w:p>
+    <w:p>
+      <w:pPr>
+        <w:pStyle w:val="ListParagraph"/>
+        <w:rPr>
+          <w:rFonts w:ascii="Times New Roman" w:eastAsia="Times New Roman" w:hAnsi="Times New Roman" w:cs="Times New Roman"/>
+          <w:sz w:val="24"/>
+          <w:szCs w:val="24"/>
+          <w:lang w:eastAsia="en-IN"/>
+        </w:rPr>
+      </w:pPr>
+    </w:p>
+    <w:p>
+      <w:pPr>
+        <w:pStyle w:val="ListParagraph"/>
+        <w:rPr>
+          <w:rFonts w:ascii="Times New Roman" w:eastAsia="Times New Roman" w:hAnsi="Times New Roman" w:cs="Times New Roman"/>
+          <w:sz w:val="24"/>
+          <w:szCs w:val="24"/>
+          <w:lang w:eastAsia="en-IN"/>
+        </w:rPr>
+      </w:pPr>
+      <w:r>
+        <w:rPr>
+          <w:rFonts w:ascii="Times New Roman" w:eastAsia="Times New Roman" w:hAnsi="Times New Roman" w:cs="Times New Roman"/>
+          <w:sz w:val="24"/>
+          <w:szCs w:val="24"/>
+          <w:lang w:eastAsia="en-IN"/>
+        </w:rPr>
+        <w:t xml:space="preserve">Recently, I have worked on projects involving payment integrations, role-based access control, </w:t>
+      </w:r>
+      <w:proofErr w:type="spellStart"/>
+      <w:r>
+        <w:rPr>
+          <w:rFonts w:ascii="Times New Roman" w:eastAsia="Times New Roman" w:hAnsi="Times New Roman" w:cs="Times New Roman"/>
+          <w:sz w:val="24"/>
+          <w:szCs w:val="24"/>
+          <w:lang w:eastAsia="en-IN"/>
+        </w:rPr>
+        <w:t>GraphQL</w:t>
+      </w:r>
+      <w:proofErr w:type="spellEnd"/>
+      <w:r>
+        <w:rPr>
+          <w:rFonts w:ascii="Times New Roman" w:eastAsia="Times New Roman" w:hAnsi="Times New Roman" w:cs="Times New Roman"/>
+          <w:sz w:val="24"/>
+          <w:szCs w:val="24"/>
+          <w:lang w:eastAsia="en-IN"/>
+        </w:rPr>
+        <w:t xml:space="preserve"> and REST APIs, analytics dashboards, recruiter and employer workflows, and AWS-based services.</w:t>
+      </w:r>
+    </w:p>
+    <w:p>
+      <w:pPr>
+        <w:pStyle w:val="ListParagraph"/>
+        <w:rPr>
+          <w:rFonts w:ascii="Times New Roman" w:eastAsia="Times New Roman" w:hAnsi="Times New Roman" w:cs="Times New Roman"/>
+          <w:sz w:val="24"/>
+          <w:szCs w:val="24"/>
+          <w:lang w:eastAsia="en-IN"/>
+        </w:rPr>
+      </w:pPr>
+    </w:p>
+    <w:p>
+      <w:pPr>
+        <w:pStyle w:val="ListParagraph"/>
+        <w:rPr>
+          <w:rFonts w:ascii="Times New Roman" w:eastAsia="Times New Roman" w:hAnsi="Times New Roman" w:cs="Times New Roman"/>
+          <w:sz w:val="24"/>
+          <w:szCs w:val="24"/>
+          <w:lang w:eastAsia="en-IN"/>
+        </w:rPr>
+      </w:pPr>
+      <w:r>
+        <w:rPr>
+          <w:rFonts w:ascii="Times New Roman" w:eastAsia="Times New Roman" w:hAnsi="Times New Roman" w:cs="Times New Roman"/>
+          <w:sz w:val="24"/>
+          <w:szCs w:val="24"/>
+          <w:lang w:eastAsia="en-IN"/>
+        </w:rPr>
+        <w:t>One of the interesting problems I worked on was building an email engagement tracking system using AWS SES and CloudWatch, where we tracked email opens, clicks, and user actions and displayed custom analytics in dashboards.</w:t>
+      </w:r>
+    </w:p>
+    <w:p>
+      <w:pPr>
+        <w:pStyle w:val="ListParagraph"/>
+        <w:rPr>
+          <w:rFonts w:ascii="Times New Roman" w:eastAsia="Times New Roman" w:hAnsi="Times New Roman" w:cs="Times New Roman"/>
+          <w:sz w:val="24"/>
+          <w:szCs w:val="24"/>
+          <w:lang w:eastAsia="en-IN"/>
+        </w:rPr>
+      </w:pPr>
+    </w:p>
+    <w:p>
+      <w:pPr>
+        <w:pStyle w:val="ListParagraph"/>
+        <w:rPr>
+          <w:rFonts w:ascii="Times New Roman" w:eastAsia="Times New Roman" w:hAnsi="Times New Roman" w:cs="Times New Roman"/>
+          <w:sz w:val="24"/>
+          <w:szCs w:val="24"/>
+          <w:lang w:eastAsia="en-IN"/>
+        </w:rPr>
+      </w:pPr>
+      <w:r>
+        <w:rPr>
+          <w:rFonts w:ascii="Times New Roman" w:eastAsia="Times New Roman" w:hAnsi="Times New Roman" w:cs="Times New Roman"/>
+          <w:sz w:val="24"/>
+          <w:szCs w:val="24"/>
+          <w:lang w:eastAsia="en-IN"/>
+        </w:rPr>
+        <w:t>I have also worked on AI-driven mentor-mentee matching using AWS Bedrock and OpenSearch vector search, where we implemented semantic matching and recommendation capabilities.</w:t>
+      </w:r>
+    </w:p>
+    <w:p>
+      <w:pPr>
+        <w:pStyle w:val="ListParagraph"/>
+        <w:rPr>
+          <w:rFonts w:ascii="Times New Roman" w:eastAsia="Times New Roman" w:hAnsi="Times New Roman" w:cs="Times New Roman"/>
+          <w:sz w:val="24"/>
+          <w:szCs w:val="24"/>
+          <w:lang w:eastAsia="en-IN"/>
+        </w:rPr>
+      </w:pPr>
+    </w:p>
+    <w:p>
+      <w:pPr>
+        <w:pStyle w:val="ListParagraph"/>
+        <w:rPr>
+          <w:rFonts w:ascii="Times New Roman" w:eastAsia="Times New Roman" w:hAnsi="Times New Roman" w:cs="Times New Roman"/>
+          <w:sz w:val="24"/>
+          <w:szCs w:val="24"/>
+          <w:lang w:eastAsia="en-IN"/>
+        </w:rPr>
+      </w:pPr>
+      <w:r>
+        <w:rPr>
+          <w:rFonts w:ascii="Times New Roman" w:eastAsia="Times New Roman" w:hAnsi="Times New Roman" w:cs="Times New Roman"/>
+          <w:sz w:val="24"/>
+          <w:szCs w:val="24"/>
+          <w:lang w:eastAsia="en-IN"/>
+        </w:rPr>
+        <w:t>I enjoy designing scalable architectures, improving application performance, and solving complex business problems through technology.</w:t>
+      </w:r>
+    </w:p>
+    <w:p>
+      <w:pPr>
+        <w:pStyle w:val="ListParagraph"/>
+        <w:rPr>
+          <w:rFonts w:ascii="Times New Roman" w:hAnsi="Times New Roman" w:cs="Times New Roman"/>
+          <w:sz w:val="26"/>
+          <w:szCs w:val="26"/>
+        </w:rPr>
+      </w:pPr>
+    </w:p>
+    <w:p>
+      <w:pPr>
+        <w:pStyle w:val="ListParagraph"/>
+        <w:rPr>
+          <w:rFonts w:ascii="Times New Roman" w:hAnsi="Times New Roman" w:cs="Times New Roman"/>
           <w:sz w:val="26"/>
           <w:szCs w:val="26"/>
           <w:lang w:val="en-US"/>
         </w:rPr>
       </w:pPr>
-      <w:r>
-        <w:rPr>
-          <w:rFonts w:ascii="Times New Roman" w:hAnsi="Times New Roman" w:cs="Times New Roman"/>
-          <w:sz w:val="26"/>
-          <w:szCs w:val="26"/>
-        </w:rPr>
-        <w:t xml:space="preserve">I am a </w:t>
-      </w:r>
-      <w:r>
-        <w:rPr>
-          <w:rStyle w:val="Strong"/>
-          <w:rFonts w:ascii="Times New Roman" w:hAnsi="Times New Roman" w:cs="Times New Roman"/>
-          <w:sz w:val="26"/>
-          <w:szCs w:val="26"/>
-        </w:rPr>
-        <w:t>Senior Software Engineer with 5</w:t>
-      </w:r>
-      <w:r>
-        <w:rPr>
-          <w:rStyle w:val="Strong"/>
-          <w:rFonts w:ascii="Times New Roman" w:hAnsi="Times New Roman" w:cs="Times New Roman"/>
-          <w:sz w:val="26"/>
-          <w:szCs w:val="26"/>
-        </w:rPr>
-        <w:t xml:space="preserve"> years of experience</w:t>
-      </w:r>
-      <w:r>
-        <w:rPr>
-          <w:rFonts w:ascii="Times New Roman" w:hAnsi="Times New Roman" w:cs="Times New Roman"/>
-          <w:sz w:val="26"/>
-          <w:szCs w:val="26"/>
-        </w:rPr>
-        <w:t xml:space="preserve"> in building scalable web applications.</w:t>
-      </w:r>
-      <w:r>
-        <w:rPr>
-          <w:rFonts w:ascii="Times New Roman" w:hAnsi="Times New Roman" w:cs="Times New Roman"/>
-          <w:sz w:val="26"/>
-          <w:szCs w:val="26"/>
-        </w:rPr>
-        <w:br/>
-        <w:t xml:space="preserve">I specialize in </w:t>
-      </w:r>
-      <w:r>
-        <w:rPr>
-          <w:rStyle w:val="Strong"/>
-          <w:rFonts w:ascii="Times New Roman" w:hAnsi="Times New Roman" w:cs="Times New Roman"/>
-          <w:sz w:val="26"/>
-          <w:szCs w:val="26"/>
-        </w:rPr>
-        <w:t>JavaScript, Types</w:t>
-      </w:r>
-      <w:r>
-        <w:rPr>
-          <w:rStyle w:val="Strong"/>
-          <w:rFonts w:ascii="Times New Roman" w:hAnsi="Times New Roman" w:cs="Times New Roman"/>
-          <w:sz w:val="26"/>
-          <w:szCs w:val="26"/>
-        </w:rPr>
-        <w:t>cript, React.js, Next.js, and Nest.js</w:t>
-      </w:r>
-      <w:r>
-        <w:rPr>
-          <w:rFonts w:ascii="Times New Roman" w:hAnsi="Times New Roman" w:cs="Times New Roman"/>
-          <w:sz w:val="26"/>
-          <w:szCs w:val="26"/>
-        </w:rPr>
-        <w:t xml:space="preserve">, with strong expertise in </w:t>
-      </w:r>
-      <w:r>
-        <w:rPr>
-          <w:rStyle w:val="Strong"/>
-          <w:rFonts w:ascii="Times New Roman" w:hAnsi="Times New Roman" w:cs="Times New Roman"/>
-          <w:sz w:val="26"/>
-          <w:szCs w:val="26"/>
-        </w:rPr>
-        <w:t>frontend architecture and backend API development</w:t>
-      </w:r>
-      <w:r>
-        <w:rPr>
-          <w:rFonts w:ascii="Times New Roman" w:hAnsi="Times New Roman" w:cs="Times New Roman"/>
-          <w:sz w:val="26"/>
-          <w:szCs w:val="26"/>
-        </w:rPr>
-        <w:t>.</w:t>
-      </w:r>
-      <w:r>
-        <w:rPr>
-          <w:rFonts w:ascii="Times New Roman" w:hAnsi="Times New Roman" w:cs="Times New Roman"/>
-          <w:sz w:val="26"/>
-          <w:szCs w:val="26"/>
-        </w:rPr>
-        <w:br/>
-        <w:t>I have worked on</w:t>
-      </w:r>
-      <w:r>
-        <w:rPr>
-          <w:rStyle w:val="Strong"/>
-          <w:rFonts w:ascii="Times New Roman" w:hAnsi="Times New Roman" w:cs="Times New Roman"/>
-          <w:sz w:val="26"/>
-          <w:szCs w:val="26"/>
-        </w:rPr>
-        <w:t xml:space="preserve"> large-scale projects</w:t>
-      </w:r>
-      <w:r>
-        <w:rPr>
-          <w:rFonts w:ascii="Times New Roman" w:hAnsi="Times New Roman" w:cs="Times New Roman"/>
-          <w:sz w:val="26"/>
-          <w:szCs w:val="26"/>
-        </w:rPr>
-        <w:t xml:space="preserve">, where I handled </w:t>
-      </w:r>
-      <w:r>
-        <w:rPr>
-          <w:rStyle w:val="Strong"/>
-          <w:rFonts w:ascii="Times New Roman" w:hAnsi="Times New Roman" w:cs="Times New Roman"/>
-          <w:sz w:val="26"/>
-          <w:szCs w:val="26"/>
-        </w:rPr>
-        <w:t>complex features</w:t>
-      </w:r>
-      <w:r>
-        <w:rPr>
-          <w:rFonts w:ascii="Times New Roman" w:hAnsi="Times New Roman" w:cs="Times New Roman"/>
-          <w:sz w:val="26"/>
-          <w:szCs w:val="26"/>
-        </w:rPr>
-        <w:t xml:space="preserve"> such as </w:t>
-      </w:r>
-      <w:r>
-        <w:rPr>
-          <w:rStyle w:val="Strong"/>
-          <w:rFonts w:ascii="Times New Roman" w:hAnsi="Times New Roman" w:cs="Times New Roman"/>
-          <w:sz w:val="26"/>
-          <w:szCs w:val="26"/>
-        </w:rPr>
-        <w:t>payment integrations, role-based dashboards, analytics modules, authentication flows, and performance optimizations</w:t>
-      </w:r>
-      <w:r>
-        <w:rPr>
-          <w:rFonts w:ascii="Times New Roman" w:hAnsi="Times New Roman" w:cs="Times New Roman"/>
-          <w:sz w:val="26"/>
-          <w:szCs w:val="26"/>
-        </w:rPr>
-        <w:t>.</w:t>
-      </w:r>
-      <w:r>
-        <w:rPr>
-          <w:rFonts w:ascii="Times New Roman" w:hAnsi="Times New Roman" w:cs="Times New Roman"/>
-          <w:sz w:val="26"/>
-          <w:szCs w:val="26"/>
-        </w:rPr>
-        <w:br/>
-        <w:t xml:space="preserve">I enjoy solving real-world problems, writing </w:t>
-      </w:r>
-      <w:r>
-        <w:rPr>
-          <w:rStyle w:val="Strong"/>
-          <w:rFonts w:ascii="Times New Roman" w:hAnsi="Times New Roman" w:cs="Times New Roman"/>
-          <w:sz w:val="26"/>
-          <w:szCs w:val="26"/>
-        </w:rPr>
-        <w:t>clean and maintainable code</w:t>
-      </w:r>
-      <w:r>
-        <w:rPr>
-          <w:rFonts w:ascii="Times New Roman" w:hAnsi="Times New Roman" w:cs="Times New Roman"/>
-          <w:sz w:val="26"/>
-          <w:szCs w:val="26"/>
-        </w:rPr>
-        <w:t xml:space="preserve">, and collaborating closely with </w:t>
-      </w:r>
-      <w:r>
-        <w:rPr>
-          <w:rStyle w:val="Strong"/>
-          <w:rFonts w:ascii="Times New Roman" w:hAnsi="Times New Roman" w:cs="Times New Roman"/>
-          <w:sz w:val="26"/>
-          <w:szCs w:val="26"/>
-        </w:rPr>
-        <w:t>product, design, and QA teams.</w:t>
-      </w:r>
-      <w:r>
-        <w:rPr>
-          <w:rStyle w:val="Strong"/>
-          <w:rFonts w:ascii="Times New Roman" w:hAnsi="Times New Roman" w:cs="Times New Roman"/>
-          <w:sz w:val="26"/>
-          <w:szCs w:val="26"/>
-        </w:rPr>
-        <w:br/>
-      </w:r>
     </w:p>
     <w:p>
       <w:pPr>
@@ -273,14 +421,22 @@
           <w:numId w:val="1"/>
         </w:numPr>
         <w:rPr>
-          <w:rStyle w:val="Strong"/>
-          <w:rFonts w:ascii="Times New Roman" w:hAnsi="Times New Roman" w:cs="Times New Roman"/>
-          <w:bCs w:val="0"/>
+          <w:rFonts w:ascii="Times New Roman" w:hAnsi="Times New Roman" w:cs="Times New Roman"/>
+          <w:b/>
+          <w:sz w:val="26"/>
+          <w:szCs w:val="26"/>
+          <w:lang w:val="en-US"/>
+        </w:rPr>
+      </w:pPr>
+      <w:r>
+        <w:rPr>
+          <w:rFonts w:ascii="Times New Roman" w:hAnsi="Times New Roman" w:cs="Times New Roman"/>
+          <w:b/>
           <w:sz w:val="32"/>
           <w:szCs w:val="32"/>
-          <w:lang w:val="en-US"/>
-        </w:rPr>
-      </w:pPr>
+        </w:rPr>
+        <w:t>Why are you looking for a change?</w:t>
+      </w:r>
       <w:r>
         <w:rPr>
           <w:rFonts w:ascii="Times New Roman" w:hAnsi="Times New Roman" w:cs="Times New Roman"/>
@@ -288,18 +444,8 @@
           <w:sz w:val="32"/>
           <w:szCs w:val="32"/>
         </w:rPr>
-        <w:t>Why are you looking for a change?</w:t>
-      </w:r>
-    </w:p>
-    <w:p>
-      <w:pPr>
-        <w:pStyle w:val="ListParagraph"/>
-        <w:rPr>
-          <w:rFonts w:ascii="Times New Roman" w:hAnsi="Times New Roman" w:cs="Times New Roman"/>
-          <w:sz w:val="24"/>
-          <w:szCs w:val="24"/>
-        </w:rPr>
-      </w:pPr>
+        <w:br/>
+      </w:r>
       <w:r>
         <w:rPr>
           <w:rStyle w:val="Strong"/>
@@ -321,124 +467,212 @@
       <w:r>
         <w:rPr>
           <w:rFonts w:ascii="Times New Roman" w:hAnsi="Times New Roman" w:cs="Times New Roman"/>
-          <w:sz w:val="24"/>
-          <w:szCs w:val="24"/>
-        </w:rPr>
-        <w:t>I’ve had a really positive experience in my current role and learned a lot by working on real production systems. At this point, I’m looking for a role where I can grow long-term, take on more responsibility, and work on projects that match my experience in React, Next.js, and backend development. From what I understood about this role, it felt like a good fit for my skills and the kind of work I want to do next</w:t>
-      </w:r>
-      <w:r>
-        <w:rPr>
-          <w:rFonts w:ascii="Times New Roman" w:hAnsi="Times New Roman" w:cs="Times New Roman"/>
-          <w:sz w:val="24"/>
-          <w:szCs w:val="24"/>
-        </w:rPr>
-        <w:t>.</w:t>
-      </w:r>
-    </w:p>
-    <w:p>
-      <w:pPr>
-        <w:pStyle w:val="ListParagraph"/>
-        <w:rPr>
-          <w:rStyle w:val="Strong"/>
-          <w:rFonts w:ascii="Times New Roman" w:hAnsi="Times New Roman" w:cs="Times New Roman"/>
-          <w:sz w:val="24"/>
-          <w:szCs w:val="24"/>
+          <w:sz w:val="26"/>
+          <w:szCs w:val="26"/>
+        </w:rPr>
+        <w:lastRenderedPageBreak/>
+        <w:t>I’ve had a great learning experience in my current organization and have worked on a variety of impactful projects over the last five years.</w:t>
+      </w:r>
+    </w:p>
+    <w:p>
+      <w:pPr>
+        <w:pStyle w:val="ListParagraph"/>
+        <w:rPr>
+          <w:rFonts w:ascii="Times New Roman" w:hAnsi="Times New Roman" w:cs="Times New Roman"/>
+          <w:b/>
+          <w:sz w:val="26"/>
+          <w:szCs w:val="26"/>
+          <w:lang w:val="en-US"/>
+        </w:rPr>
+      </w:pPr>
+    </w:p>
+    <w:p>
+      <w:pPr>
+        <w:pStyle w:val="ListParagraph"/>
+        <w:rPr>
+          <w:rFonts w:ascii="Times New Roman" w:eastAsia="Times New Roman" w:hAnsi="Times New Roman" w:cs="Times New Roman"/>
+          <w:sz w:val="26"/>
+          <w:szCs w:val="26"/>
+          <w:lang w:eastAsia="en-IN"/>
+        </w:rPr>
+      </w:pPr>
+      <w:r>
+        <w:rPr>
+          <w:rFonts w:ascii="Times New Roman" w:eastAsia="Times New Roman" w:hAnsi="Times New Roman" w:cs="Times New Roman"/>
+          <w:sz w:val="26"/>
+          <w:szCs w:val="26"/>
+          <w:lang w:eastAsia="en-IN"/>
+        </w:rPr>
+        <w:t>My role has evolved beyond development, and I’m involved in client discussions, requirement analysis, solution design, and implementation. I’ve had opportunities to work on large-scale applications, AWS-based solutions, analytics systems, and AI-powered features.</w:t>
+      </w:r>
+    </w:p>
+    <w:p>
+      <w:pPr>
+        <w:pStyle w:val="ListParagraph"/>
+        <w:rPr>
+          <w:rFonts w:ascii="Times New Roman" w:eastAsia="Times New Roman" w:hAnsi="Times New Roman" w:cs="Times New Roman"/>
+          <w:sz w:val="26"/>
+          <w:szCs w:val="26"/>
+          <w:lang w:eastAsia="en-IN"/>
+        </w:rPr>
+      </w:pPr>
+    </w:p>
+    <w:p>
+      <w:pPr>
+        <w:pStyle w:val="ListParagraph"/>
+        <w:rPr>
+          <w:rFonts w:ascii="Times New Roman" w:hAnsi="Times New Roman" w:cs="Times New Roman"/>
+          <w:b/>
+          <w:sz w:val="26"/>
+          <w:szCs w:val="26"/>
+          <w:lang w:val="en-US"/>
+        </w:rPr>
+      </w:pPr>
+      <w:r>
+        <w:rPr>
+          <w:rFonts w:ascii="Times New Roman" w:eastAsia="Times New Roman" w:hAnsi="Times New Roman" w:cs="Times New Roman"/>
+          <w:sz w:val="26"/>
+          <w:szCs w:val="26"/>
+          <w:lang w:eastAsia="en-IN"/>
+        </w:rPr>
+        <w:t>At this stage of my career, I’m looking for an opportunity that offers larger technical challenges, broader ownership, and long-term growth. I’m particularly interested in working with teams that focus on scalable product development and modern engineering practices, which is why this opportunity caught my attention.</w:t>
+      </w:r>
+    </w:p>
+    <w:p>
+      <w:pPr>
+        <w:pStyle w:val="ListParagraph"/>
+        <w:rPr>
+          <w:rStyle w:val="Strong"/>
+          <w:rFonts w:ascii="Times New Roman" w:hAnsi="Times New Roman" w:cs="Times New Roman"/>
+          <w:sz w:val="26"/>
+          <w:szCs w:val="26"/>
+        </w:rPr>
+      </w:pPr>
+    </w:p>
+    <w:p>
+      <w:pPr>
+        <w:pStyle w:val="ListParagraph"/>
+        <w:rPr>
+          <w:rStyle w:val="Strong"/>
+          <w:rFonts w:ascii="Times New Roman" w:hAnsi="Times New Roman" w:cs="Times New Roman"/>
+          <w:sz w:val="26"/>
+          <w:szCs w:val="26"/>
+        </w:rPr>
+      </w:pPr>
+      <w:r>
+        <w:rPr>
+          <w:rStyle w:val="Strong"/>
+          <w:rFonts w:ascii="Times New Roman" w:hAnsi="Times New Roman" w:cs="Times New Roman"/>
+          <w:sz w:val="26"/>
+          <w:szCs w:val="26"/>
+        </w:rPr>
+        <w:t>Technical</w:t>
+      </w:r>
+    </w:p>
+    <w:p>
+      <w:pPr>
+        <w:pStyle w:val="ListParagraph"/>
+        <w:rPr>
+          <w:rFonts w:ascii="Times New Roman" w:eastAsia="Times New Roman" w:hAnsi="Times New Roman" w:cs="Times New Roman"/>
+          <w:sz w:val="26"/>
+          <w:szCs w:val="26"/>
+          <w:lang w:eastAsia="en-IN"/>
+        </w:rPr>
+      </w:pPr>
+      <w:r>
+        <w:rPr>
+          <w:rFonts w:ascii="Times New Roman" w:eastAsia="Times New Roman" w:hAnsi="Times New Roman" w:cs="Times New Roman"/>
+          <w:sz w:val="26"/>
+          <w:szCs w:val="26"/>
+          <w:lang w:eastAsia="en-IN"/>
+        </w:rPr>
+        <w:t>Over the past five years, I’ve worked on end-to-end product development, including frontend architecture, backend APIs, client interactions, requirement discussions, and system design contributions.</w:t>
+      </w:r>
+    </w:p>
+    <w:p>
+      <w:pPr>
+        <w:pStyle w:val="ListParagraph"/>
+        <w:rPr>
+          <w:rFonts w:ascii="Times New Roman" w:eastAsia="Times New Roman" w:hAnsi="Times New Roman" w:cs="Times New Roman"/>
+          <w:sz w:val="26"/>
+          <w:szCs w:val="26"/>
+          <w:lang w:eastAsia="en-IN"/>
+        </w:rPr>
+      </w:pPr>
+    </w:p>
+    <w:p>
+      <w:pPr>
+        <w:pStyle w:val="ListParagraph"/>
+        <w:rPr>
+          <w:rFonts w:ascii="Times New Roman" w:eastAsia="Times New Roman" w:hAnsi="Times New Roman" w:cs="Times New Roman"/>
+          <w:sz w:val="26"/>
+          <w:szCs w:val="26"/>
+          <w:lang w:eastAsia="en-IN"/>
+        </w:rPr>
+      </w:pPr>
+      <w:r>
+        <w:rPr>
+          <w:rFonts w:ascii="Times New Roman" w:eastAsia="Times New Roman" w:hAnsi="Times New Roman" w:cs="Times New Roman"/>
+          <w:sz w:val="26"/>
+          <w:szCs w:val="26"/>
+          <w:lang w:eastAsia="en-IN"/>
+        </w:rPr>
+        <w:t>For example, in the AfricaN</w:t>
+      </w:r>
+      <w:r>
+        <w:rPr>
+          <w:rFonts w:ascii="Times New Roman" w:eastAsia="Times New Roman" w:hAnsi="Times New Roman" w:cs="Times New Roman"/>
+          <w:sz w:val="26"/>
+          <w:szCs w:val="26"/>
+          <w:lang w:eastAsia="en-IN"/>
+        </w:rPr>
+        <w:t>xt platform, I was involved in designing and implementing Phase 2 features, where we discussed scalability, data flow, API design, and AWS-based integrations. I’ve also worked on email analytics systems using AWS SES and CloudWatch, as well as AI-powered mentor-mentee matching using AWS Bedrock and OpenSearch.</w:t>
+      </w:r>
+    </w:p>
+    <w:p>
+      <w:pPr>
+        <w:pStyle w:val="ListParagraph"/>
+        <w:rPr>
+          <w:rFonts w:ascii="Times New Roman" w:eastAsia="Times New Roman" w:hAnsi="Times New Roman" w:cs="Times New Roman"/>
+          <w:sz w:val="26"/>
+          <w:szCs w:val="26"/>
+          <w:lang w:eastAsia="en-IN"/>
+        </w:rPr>
+      </w:pPr>
+    </w:p>
+    <w:p>
+      <w:pPr>
+        <w:pStyle w:val="ListParagraph"/>
+        <w:rPr>
+          <w:rFonts w:ascii="Times New Roman" w:hAnsi="Times New Roman" w:cs="Times New Roman"/>
+          <w:b/>
+          <w:bCs/>
+          <w:sz w:val="26"/>
+          <w:szCs w:val="26"/>
+        </w:rPr>
+      </w:pPr>
+      <w:r>
+        <w:rPr>
+          <w:rFonts w:ascii="Times New Roman" w:eastAsia="Times New Roman" w:hAnsi="Times New Roman" w:cs="Times New Roman"/>
+          <w:sz w:val="26"/>
+          <w:szCs w:val="26"/>
+          <w:lang w:eastAsia="en-IN"/>
+        </w:rPr>
+        <w:t>I’m not looking for a change because of a lack of exposure. Instead, I’m looking for an environment where I can contribute at a larger scale, work on more complex engineering challenges, and continue growing as a senior engineer while taking greater ownership of technical decisions.</w:t>
+      </w:r>
+    </w:p>
+    <w:p>
+      <w:pPr>
+        <w:pStyle w:val="ListParagraph"/>
+        <w:rPr>
+          <w:rStyle w:val="Strong"/>
+          <w:rFonts w:ascii="Times New Roman" w:hAnsi="Times New Roman" w:cs="Times New Roman"/>
+          <w:sz w:val="26"/>
+          <w:szCs w:val="26"/>
         </w:rPr>
       </w:pPr>
       <w:bookmarkStart w:id="0" w:name="_GoBack"/>
       <w:bookmarkEnd w:id="0"/>
-    </w:p>
-    <w:p>
-      <w:pPr>
-        <w:pStyle w:val="ListParagraph"/>
-        <w:rPr>
-          <w:rStyle w:val="Strong"/>
-          <w:rFonts w:ascii="Times New Roman" w:hAnsi="Times New Roman" w:cs="Times New Roman"/>
-          <w:sz w:val="26"/>
-          <w:szCs w:val="26"/>
-        </w:rPr>
-      </w:pPr>
-      <w:r>
-        <w:rPr>
-          <w:rStyle w:val="Strong"/>
-          <w:rFonts w:ascii="Times New Roman" w:hAnsi="Times New Roman" w:cs="Times New Roman"/>
-          <w:sz w:val="26"/>
-          <w:szCs w:val="26"/>
-        </w:rPr>
-        <w:t>Technical</w:t>
-      </w:r>
-    </w:p>
-    <w:p>
-      <w:pPr>
-        <w:pStyle w:val="ListParagraph"/>
-        <w:rPr>
-          <w:rFonts w:ascii="Times New Roman" w:eastAsia="Times New Roman" w:hAnsi="Times New Roman" w:cs="Times New Roman"/>
-          <w:sz w:val="26"/>
-          <w:szCs w:val="26"/>
-          <w:lang w:eastAsia="en-IN"/>
-        </w:rPr>
-      </w:pPr>
-      <w:r>
-        <w:rPr>
-          <w:rFonts w:ascii="Times New Roman" w:eastAsia="Times New Roman" w:hAnsi="Times New Roman" w:cs="Times New Roman"/>
-          <w:sz w:val="26"/>
-          <w:szCs w:val="26"/>
-          <w:lang w:eastAsia="en-IN"/>
-        </w:rPr>
-        <w:t>Over the last few years, I’ve worked extensively on frontend-heavy platforms and admin dashboards, and for the past phase of my role, I’ve also been handling backend APIs using NestJS. While I’ve gained strong hands-on experience, most architectural decisions are already defined.</w:t>
-      </w:r>
-    </w:p>
-    <w:p>
-      <w:pPr>
-        <w:pStyle w:val="ListParagraph"/>
-        <w:rPr>
-          <w:rFonts w:ascii="Times New Roman" w:hAnsi="Times New Roman" w:cs="Times New Roman"/>
-          <w:b/>
-          <w:bCs/>
-          <w:sz w:val="26"/>
-          <w:szCs w:val="26"/>
-        </w:rPr>
-      </w:pPr>
-      <w:r>
-        <w:rPr>
-          <w:rFonts w:ascii="Times New Roman" w:eastAsia="Times New Roman" w:hAnsi="Times New Roman" w:cs="Times New Roman"/>
-          <w:sz w:val="26"/>
-          <w:szCs w:val="26"/>
-          <w:lang w:eastAsia="en-IN"/>
-        </w:rPr>
-        <w:t xml:space="preserve">I’m now looking for a role where I can be more involved in </w:t>
-      </w:r>
-      <w:r>
-        <w:rPr>
-          <w:rFonts w:ascii="Times New Roman" w:eastAsia="Times New Roman" w:hAnsi="Times New Roman" w:cs="Times New Roman"/>
-          <w:b/>
-          <w:bCs/>
-          <w:sz w:val="26"/>
-          <w:szCs w:val="26"/>
-          <w:lang w:eastAsia="en-IN"/>
-        </w:rPr>
-        <w:t>system design, architectural discussions, and scalability decisions</w:t>
-      </w:r>
-      <w:r>
-        <w:rPr>
-          <w:rFonts w:ascii="Times New Roman" w:eastAsia="Times New Roman" w:hAnsi="Times New Roman" w:cs="Times New Roman"/>
-          <w:sz w:val="26"/>
-          <w:szCs w:val="26"/>
-          <w:lang w:eastAsia="en-IN"/>
-        </w:rPr>
-        <w:t>, and work on technically challenging problems beyond just feature implementation</w:t>
-      </w:r>
-    </w:p>
-    <w:p>
-      <w:pPr>
-        <w:pStyle w:val="ListParagraph"/>
-        <w:rPr>
-          <w:rStyle w:val="Strong"/>
-          <w:rFonts w:ascii="Times New Roman" w:hAnsi="Times New Roman" w:cs="Times New Roman"/>
-          <w:sz w:val="26"/>
-          <w:szCs w:val="26"/>
-        </w:rPr>
-      </w:pPr>
     </w:p>
     <w:p>
       <w:pPr>
@@ -624,7 +858,63 @@
           <w:szCs w:val="26"/>
         </w:rPr>
         <w:br/>
-      </w:r>
+        <w:t xml:space="preserve">Additionally, I’m a </w:t>
+      </w:r>
+      <w:r>
+        <w:rPr>
+          <w:rStyle w:val="Strong"/>
+          <w:rFonts w:ascii="Times New Roman" w:hAnsi="Times New Roman" w:cs="Times New Roman"/>
+          <w:sz w:val="26"/>
+          <w:szCs w:val="26"/>
+        </w:rPr>
+        <w:t>team player</w:t>
+      </w:r>
+      <w:r>
+        <w:rPr>
+          <w:rFonts w:ascii="Times New Roman" w:hAnsi="Times New Roman" w:cs="Times New Roman"/>
+          <w:sz w:val="26"/>
+          <w:szCs w:val="26"/>
+        </w:rPr>
+        <w:t xml:space="preserve"> who collaborates well with cross-functional teams to deliver results</w:t>
+      </w:r>
+    </w:p>
+    <w:p>
+      <w:pPr>
+        <w:pStyle w:val="ListParagraph"/>
+        <w:rPr>
+          <w:rFonts w:ascii="Times New Roman" w:hAnsi="Times New Roman" w:cs="Times New Roman"/>
+        </w:rPr>
+      </w:pPr>
+    </w:p>
+    <w:p>
+      <w:pPr>
+        <w:pStyle w:val="ListParagraph"/>
+        <w:rPr>
+          <w:rFonts w:ascii="Times New Roman" w:hAnsi="Times New Roman" w:cs="Times New Roman"/>
+          <w:b/>
+          <w:sz w:val="26"/>
+          <w:szCs w:val="26"/>
+        </w:rPr>
+      </w:pPr>
+      <w:r>
+        <w:rPr>
+          <w:rFonts w:ascii="Times New Roman" w:hAnsi="Times New Roman" w:cs="Times New Roman"/>
+          <w:b/>
+          <w:sz w:val="26"/>
+          <w:szCs w:val="26"/>
+        </w:rPr>
+        <w:t>Technical Round</w:t>
+      </w:r>
+    </w:p>
+    <w:p>
+      <w:pPr>
+        <w:pStyle w:val="ListParagraph"/>
+        <w:rPr>
+          <w:rFonts w:ascii="Times New Roman" w:hAnsi="Times New Roman" w:cs="Times New Roman"/>
+          <w:sz w:val="26"/>
+          <w:szCs w:val="26"/>
+        </w:rPr>
+      </w:pPr>
       <w:r>
         <w:rPr>
           <w:rFonts w:ascii="Times New Roman" w:hAnsi="Times New Roman" w:cs="Times New Roman"/>
@@ -632,69 +922,6 @@
           <w:szCs w:val="26"/>
         </w:rPr>
         <w:lastRenderedPageBreak/>
-        <w:t xml:space="preserve">Additionally, I’m a </w:t>
-      </w:r>
-      <w:r>
-        <w:rPr>
-          <w:rStyle w:val="Strong"/>
-          <w:rFonts w:ascii="Times New Roman" w:hAnsi="Times New Roman" w:cs="Times New Roman"/>
-          <w:sz w:val="26"/>
-          <w:szCs w:val="26"/>
-        </w:rPr>
-        <w:t>team player</w:t>
-      </w:r>
-      <w:r>
-        <w:rPr>
-          <w:rFonts w:ascii="Times New Roman" w:hAnsi="Times New Roman" w:cs="Times New Roman"/>
-          <w:sz w:val="26"/>
-          <w:szCs w:val="26"/>
-        </w:rPr>
-        <w:t xml:space="preserve"> who collaborates well with cross-functional teams to deliver results</w:t>
-      </w:r>
-    </w:p>
-    <w:p>
-      <w:pPr>
-        <w:pStyle w:val="ListParagraph"/>
-        <w:rPr>
-          <w:rFonts w:ascii="Times New Roman" w:hAnsi="Times New Roman" w:cs="Times New Roman"/>
-        </w:rPr>
-      </w:pPr>
-    </w:p>
-    <w:p>
-      <w:pPr>
-        <w:pStyle w:val="ListParagraph"/>
-        <w:rPr>
-          <w:rFonts w:ascii="Times New Roman" w:hAnsi="Times New Roman" w:cs="Times New Roman"/>
-          <w:b/>
-          <w:sz w:val="26"/>
-          <w:szCs w:val="26"/>
-        </w:rPr>
-      </w:pPr>
-      <w:r>
-        <w:rPr>
-          <w:rFonts w:ascii="Times New Roman" w:hAnsi="Times New Roman" w:cs="Times New Roman"/>
-          <w:b/>
-          <w:sz w:val="26"/>
-          <w:szCs w:val="26"/>
-        </w:rPr>
-        <w:t>Technical Round</w:t>
-      </w:r>
-    </w:p>
-    <w:p>
-      <w:pPr>
-        <w:pStyle w:val="ListParagraph"/>
-        <w:rPr>
-          <w:rFonts w:ascii="Times New Roman" w:hAnsi="Times New Roman" w:cs="Times New Roman"/>
-          <w:sz w:val="26"/>
-          <w:szCs w:val="26"/>
-        </w:rPr>
-      </w:pPr>
-      <w:r>
-        <w:rPr>
-          <w:rFonts w:ascii="Times New Roman" w:hAnsi="Times New Roman" w:cs="Times New Roman"/>
-          <w:sz w:val="26"/>
-          <w:szCs w:val="26"/>
-        </w:rPr>
         <w:t xml:space="preserve">My core strength is my </w:t>
       </w:r>
       <w:r>
@@ -1277,16 +1504,7 @@
           <w:sz w:val="26"/>
           <w:szCs w:val="26"/>
         </w:rPr>
-        <w:t xml:space="preserve"> that can scale </w:t>
-      </w:r>
-      <w:r>
-        <w:rPr>
-          <w:rFonts w:ascii="Times New Roman" w:hAnsi="Times New Roman" w:cs="Times New Roman"/>
-          <w:sz w:val="26"/>
-          <w:szCs w:val="26"/>
-        </w:rPr>
-        <w:lastRenderedPageBreak/>
-        <w:t>efficiently.</w:t>
+        <w:t xml:space="preserve"> that can scale efficiently.</w:t>
       </w:r>
       <w:r>
         <w:rPr>
@@ -1432,6 +1650,14 @@
         </w:rPr>
         <w:t>, adapt quickly to new challenges, and contribute effectively from day one while growing with the organization</w:t>
       </w:r>
+      <w:r>
+        <w:rPr>
+          <w:rFonts w:ascii="Times New Roman" w:hAnsi="Times New Roman" w:cs="Times New Roman"/>
+          <w:sz w:val="26"/>
+          <w:szCs w:val="26"/>
+        </w:rPr>
+        <w:t xml:space="preserve"> </w:t>
+      </w:r>
     </w:p>
     <w:p>
       <w:pPr>
@@ -1796,15 +2022,7 @@
           <w:sz w:val="24"/>
           <w:szCs w:val="24"/>
         </w:rPr>
-        <w:t>I have 5</w:t>
-      </w:r>
-      <w:r>
-        <w:rPr>
-          <w:rFonts w:ascii="Times New Roman" w:hAnsi="Times New Roman" w:cs="Times New Roman"/>
-          <w:sz w:val="24"/>
-          <w:szCs w:val="24"/>
-        </w:rPr>
-        <w:t xml:space="preserve"> years of professional experience as a web developer, working extensively on the frontend and on backend CMS solutions such as WordPress, Directus, and Netlify CMS. Over the last 2+ years, I’ve also been building backend systems using Node.js, NestJS, and GraphQL.</w:t>
+        <w:t>I have 5 years of professional experience as a web developer, working extensively on the frontend and on backend CMS solutions such as WordPress, Directus, and Netlify CMS. Over the last 2+ years, I’ve also been building backend systems using Node.js, NestJS, and GraphQL.</w:t>
       </w:r>
     </w:p>
     <w:p>
@@ -1880,7 +2098,6 @@
           <w:sz w:val="26"/>
           <w:szCs w:val="26"/>
         </w:rPr>
-        <w:lastRenderedPageBreak/>
         <w:t xml:space="preserve">I currently work as a </w:t>
       </w:r>
       <w:r>
@@ -1924,7 +2141,16 @@
           <w:sz w:val="26"/>
           <w:szCs w:val="26"/>
         </w:rPr>
-        <w:t xml:space="preserve">, handle integrations like payment systems, and actively participate in </w:t>
+        <w:t xml:space="preserve">, handle </w:t>
+      </w:r>
+      <w:r>
+        <w:rPr>
+          <w:rFonts w:ascii="Times New Roman" w:hAnsi="Times New Roman" w:cs="Times New Roman"/>
+          <w:sz w:val="26"/>
+          <w:szCs w:val="26"/>
+        </w:rPr>
+        <w:lastRenderedPageBreak/>
+        <w:t xml:space="preserve">integrations like payment systems, and actively participate in </w:t>
       </w:r>
       <w:r>
         <w:rPr>
@@ -2512,48 +2738,57 @@
           <w:sz w:val="26"/>
           <w:szCs w:val="26"/>
         </w:rPr>
+        <w:t>Technical Round</w:t>
+      </w:r>
+    </w:p>
+    <w:p>
+      <w:pPr>
+        <w:pStyle w:val="ListParagraph"/>
+        <w:rPr>
+          <w:rFonts w:ascii="Times New Roman" w:eastAsia="Times New Roman" w:hAnsi="Times New Roman" w:cs="Times New Roman"/>
+          <w:sz w:val="26"/>
+          <w:szCs w:val="26"/>
+          <w:lang w:eastAsia="en-IN"/>
+        </w:rPr>
+      </w:pPr>
+      <w:r>
+        <w:rPr>
+          <w:rFonts w:ascii="Times New Roman" w:eastAsia="Times New Roman" w:hAnsi="Times New Roman" w:cs="Times New Roman"/>
+          <w:sz w:val="26"/>
+          <w:szCs w:val="26"/>
+          <w:lang w:eastAsia="en-IN"/>
+        </w:rPr>
+        <w:t xml:space="preserve">I work as a </w:t>
+      </w:r>
+      <w:r>
+        <w:rPr>
+          <w:rFonts w:ascii="Times New Roman" w:eastAsia="Times New Roman" w:hAnsi="Times New Roman" w:cs="Times New Roman"/>
+          <w:b/>
+          <w:bCs/>
+          <w:sz w:val="26"/>
+          <w:szCs w:val="26"/>
+          <w:lang w:eastAsia="en-IN"/>
+        </w:rPr>
+        <w:t>full-stack developer</w:t>
+      </w:r>
+      <w:r>
+        <w:rPr>
+          <w:rFonts w:ascii="Times New Roman" w:eastAsia="Times New Roman" w:hAnsi="Times New Roman" w:cs="Times New Roman"/>
+          <w:sz w:val="26"/>
+          <w:szCs w:val="26"/>
+          <w:lang w:eastAsia="en-IN"/>
+        </w:rPr>
+        <w:t xml:space="preserve">, handling both frontend and backend responsibilities. On the frontend, I design and implement scalable UI </w:t>
+      </w:r>
+      <w:r>
+        <w:rPr>
+          <w:rFonts w:ascii="Times New Roman" w:eastAsia="Times New Roman" w:hAnsi="Times New Roman" w:cs="Times New Roman"/>
+          <w:sz w:val="26"/>
+          <w:szCs w:val="26"/>
+          <w:lang w:eastAsia="en-IN"/>
+        </w:rPr>
         <w:lastRenderedPageBreak/>
-        <w:t>Technical Round</w:t>
-      </w:r>
-    </w:p>
-    <w:p>
-      <w:pPr>
-        <w:pStyle w:val="ListParagraph"/>
-        <w:rPr>
-          <w:rFonts w:ascii="Times New Roman" w:eastAsia="Times New Roman" w:hAnsi="Times New Roman" w:cs="Times New Roman"/>
-          <w:sz w:val="26"/>
-          <w:szCs w:val="26"/>
-          <w:lang w:eastAsia="en-IN"/>
-        </w:rPr>
-      </w:pPr>
-      <w:r>
-        <w:rPr>
-          <w:rFonts w:ascii="Times New Roman" w:eastAsia="Times New Roman" w:hAnsi="Times New Roman" w:cs="Times New Roman"/>
-          <w:sz w:val="26"/>
-          <w:szCs w:val="26"/>
-          <w:lang w:eastAsia="en-IN"/>
-        </w:rPr>
-        <w:t xml:space="preserve">I work as a </w:t>
-      </w:r>
-      <w:r>
-        <w:rPr>
-          <w:rFonts w:ascii="Times New Roman" w:eastAsia="Times New Roman" w:hAnsi="Times New Roman" w:cs="Times New Roman"/>
-          <w:b/>
-          <w:bCs/>
-          <w:sz w:val="26"/>
-          <w:szCs w:val="26"/>
-          <w:lang w:eastAsia="en-IN"/>
-        </w:rPr>
-        <w:t>full-stack developer</w:t>
-      </w:r>
-      <w:r>
-        <w:rPr>
-          <w:rFonts w:ascii="Times New Roman" w:eastAsia="Times New Roman" w:hAnsi="Times New Roman" w:cs="Times New Roman"/>
-          <w:sz w:val="26"/>
-          <w:szCs w:val="26"/>
-          <w:lang w:eastAsia="en-IN"/>
-        </w:rPr>
-        <w:t>, handling both frontend and backend responsibilities. On the frontend, I design and implement scalable UI components, manage state, handle complex forms, and integrate APIs using React and Next.js.</w:t>
+        <w:t>components, manage state, handle complex forms, and integrate APIs using React and Next.js.</w:t>
       </w:r>
     </w:p>
     <w:p>
@@ -3023,6 +3258,7 @@
           <w:sz w:val="26"/>
           <w:szCs w:val="26"/>
         </w:rPr>
+        <w:lastRenderedPageBreak/>
         <w:t>I collaborate closely with product managers, designers, and QA teams. I participate in requirement discussions, provide technical inputs, and support testing and releases</w:t>
       </w:r>
     </w:p>

</xml_diff>